<commit_message>
Fix Algorithm 1 rendering in docx: line numbers and indentation
Two pandoc/docx quirks were breaking the algorithm block: a bare
text-mode digit right after a spacing macro (\hspace, \quad) at the
start of a paragraph's visible run got silently dropped on export, and
neither \hspace{Nem} nor \quad produced any actual indentation in the
exported docx. Wrapped line numbers in math mode and switched
indentation to literal non-breaking spaces, both of which pandoc
preserves correctly. Algorithm 1 now matches the PDF's nested
structure in the docx.
</commit_message>
<xml_diff>
--- a/paper_v2/ftr_phase_transition.docx
+++ b/paper_v2/ftr_phase_transition.docx
@@ -9751,8 +9751,13 @@
       <w:pPr>
         <w:pStyle w:val="BodyText"/>
       </w:pPr>
-      <w:r>
-        <w:t xml:space="preserve">1: </w:t>
+      <m:oMath>
+        <m:r>
+          <m:t>1</m:t>
+        </m:r>
+      </m:oMath>
+      <w:r>
+        <w:t xml:space="preserve">: </w:t>
       </w:r>
       <w:r>
         <w:rPr>
@@ -9806,7 +9811,15 @@
         <w:pStyle w:val="BodyText"/>
       </w:pPr>
       <w:r>
-        <w:t xml:space="preserve">2: </w:t>
+        <w:t xml:space="preserve">    </w:t>
+      </w:r>
+      <m:oMath>
+        <m:r>
+          <m:t>2</m:t>
+        </m:r>
+      </m:oMath>
+      <w:r>
+        <w:t xml:space="preserve">: </w:t>
       </w:r>
       <m:oMath>
         <m:r>
@@ -9885,7 +9898,15 @@
         <w:pStyle w:val="BodyText"/>
       </w:pPr>
       <w:r>
-        <w:t xml:space="preserve">3: </w:t>
+        <w:t xml:space="preserve">    </w:t>
+      </w:r>
+      <m:oMath>
+        <m:r>
+          <m:t>3</m:t>
+        </m:r>
+      </m:oMath>
+      <w:r>
+        <w:t xml:space="preserve">: </w:t>
       </w:r>
       <m:oMath>
         <m:sSub>
@@ -9969,7 +9990,15 @@
         <w:pStyle w:val="BodyText"/>
       </w:pPr>
       <w:r>
-        <w:t xml:space="preserve">4: run 1 warmup epoch of gradient steps on</w:t>
+        <w:t xml:space="preserve">    </w:t>
+      </w:r>
+      <m:oMath>
+        <m:r>
+          <m:t>4</m:t>
+        </m:r>
+      </m:oMath>
+      <w:r>
+        <w:t xml:space="preserve">: run 1 warmup epoch of gradient steps on</w:t>
       </w:r>
       <w:r>
         <w:t xml:space="preserve"> </w:t>
@@ -10103,7 +10132,15 @@
         <w:pStyle w:val="BodyText"/>
       </w:pPr>
       <w:r>
-        <w:t xml:space="preserve">5: </w:t>
+        <w:t xml:space="preserve">    </w:t>
+      </w:r>
+      <m:oMath>
+        <m:r>
+          <m:t>5</m:t>
+        </m:r>
+      </m:oMath>
+      <w:r>
+        <w:t xml:space="preserve">: </w:t>
       </w:r>
       <w:r>
         <w:rPr>
@@ -10159,7 +10196,15 @@
         <w:pStyle w:val="BodyText"/>
       </w:pPr>
       <w:r>
-        <w:t xml:space="preserve">6: sample batch</w:t>
+        <w:t xml:space="preserve">        </w:t>
+      </w:r>
+      <m:oMath>
+        <m:r>
+          <m:t>6</m:t>
+        </m:r>
+      </m:oMath>
+      <w:r>
+        <w:t xml:space="preserve">: sample batch</w:t>
       </w:r>
       <w:r>
         <w:t xml:space="preserve"> </w:t>
@@ -10197,7 +10242,15 @@
         <w:pStyle w:val="BodyText"/>
       </w:pPr>
       <w:r>
-        <w:t xml:space="preserve">7: </w:t>
+        <w:t xml:space="preserve">        </w:t>
+      </w:r>
+      <m:oMath>
+        <m:r>
+          <m:t>7</m:t>
+        </m:r>
+      </m:oMath>
+      <w:r>
+        <w:t xml:space="preserve">: </w:t>
       </w:r>
       <m:oMath>
         <m:r>
@@ -10342,7 +10395,15 @@
         <w:pStyle w:val="BodyText"/>
       </w:pPr>
       <w:r>
-        <w:t xml:space="preserve">8: </w:t>
+        <w:t xml:space="preserve">        </w:t>
+      </w:r>
+      <m:oMath>
+        <m:r>
+          <m:t>8</m:t>
+        </m:r>
+      </m:oMath>
+      <w:r>
+        <w:t xml:space="preserve">: </w:t>
       </w:r>
       <m:oMath>
         <m:r>
@@ -10502,7 +10563,15 @@
         <w:pStyle w:val="BodyText"/>
       </w:pPr>
       <w:r>
-        <w:t xml:space="preserve">9: </w:t>
+        <w:t xml:space="preserve">        </w:t>
+      </w:r>
+      <m:oMath>
+        <m:r>
+          <m:t>9</m:t>
+        </m:r>
+      </m:oMath>
+      <w:r>
+        <w:t xml:space="preserve">: </w:t>
       </w:r>
       <m:oMath>
         <m:r>
@@ -10582,7 +10651,15 @@
         <w:pStyle w:val="BodyText"/>
       </w:pPr>
       <w:r>
-        <w:t xml:space="preserve">10: </w:t>
+        <w:t xml:space="preserve">        </w:t>
+      </w:r>
+      <m:oMath>
+        <m:r>
+          <m:t>10</m:t>
+        </m:r>
+      </m:oMath>
+      <w:r>
+        <w:t xml:space="preserve">: </w:t>
       </w:r>
       <m:oMath>
         <m:r>
@@ -10683,7 +10760,15 @@
         <w:pStyle w:val="BodyText"/>
       </w:pPr>
       <w:r>
-        <w:t xml:space="preserve">11: </w:t>
+        <w:t xml:space="preserve">    </w:t>
+      </w:r>
+      <m:oMath>
+        <m:r>
+          <m:t>11</m:t>
+        </m:r>
+      </m:oMath>
+      <w:r>
+        <w:t xml:space="preserve">: </w:t>
       </w:r>
       <w:r>
         <w:rPr>
@@ -10697,8 +10782,13 @@
       <w:pPr>
         <w:pStyle w:val="BodyText"/>
       </w:pPr>
-      <w:r>
-        <w:t xml:space="preserve">12: </w:t>
+      <m:oMath>
+        <m:r>
+          <m:t>12</m:t>
+        </m:r>
+      </m:oMath>
+      <w:r>
+        <w:t xml:space="preserve">: </w:t>
       </w:r>
       <w:r>
         <w:rPr>
@@ -10712,8 +10802,13 @@
       <w:pPr>
         <w:pStyle w:val="BodyText"/>
       </w:pPr>
-      <w:r>
-        <w:t xml:space="preserve">13: </w:t>
+      <m:oMath>
+        <m:r>
+          <m:t>13</m:t>
+        </m:r>
+      </m:oMath>
+      <w:r>
+        <w:t xml:space="preserve">: </w:t>
       </w:r>
       <w:r>
         <w:rPr>

</xml_diff>